<commit_message>
DAL & BIZ layer Tests
</commit_message>
<xml_diff>
--- a/CA2_OOP.docx
+++ b/CA2_OOP.docx
@@ -10,6 +10,7 @@
           <w:docPartUnique/>
         </w:docPartObj>
       </w:sdtPr>
+      <w:sdtEndPr/>
       <w:sdtContent>
         <w:p>
           <w:r>
@@ -171,6 +172,7 @@
                                         <w:dataBinding w:prefixMappings="xmlns:ns0='http://purl.org/dc/elements/1.1/' xmlns:ns1='http://schemas.openxmlformats.org/package/2006/metadata/core-properties' " w:xpath="/ns1:coreProperties[1]/ns0:title[1]" w:storeItemID="{6C3C8BC8-F283-45AE-878A-BAB7291924A1}"/>
                                         <w:text/>
                                       </w:sdtPr>
+                                      <w:sdtEndPr/>
                                       <w:sdtContent>
                                         <w:p>
                                           <w:pPr>
@@ -209,6 +211,7 @@
                                         <w:dataBinding w:prefixMappings="xmlns:ns0='http://purl.org/dc/elements/1.1/' xmlns:ns1='http://schemas.openxmlformats.org/package/2006/metadata/core-properties' " w:xpath="/ns1:coreProperties[1]/ns0:subject[1]" w:storeItemID="{6C3C8BC8-F283-45AE-878A-BAB7291924A1}"/>
                                         <w:text/>
                                       </w:sdtPr>
+                                      <w:sdtEndPr/>
                                       <w:sdtContent>
                                         <w:p>
                                           <w:pPr>
@@ -265,6 +268,7 @@
                                         <w:dataBinding w:prefixMappings="xmlns:ns0='http://schemas.microsoft.com/office/2006/coverPageProps' " w:xpath="/ns0:CoverPageProperties[1]/ns0:Abstract[1]" w:storeItemID="{55AF091B-3C7A-41E3-B477-F2FDAA23CFDA}"/>
                                         <w:text/>
                                       </w:sdtPr>
+                                      <w:sdtEndPr/>
                                       <w:sdtContent>
                                         <w:p>
                                           <w:pPr>
@@ -294,6 +298,7 @@
                                         <w:dataBinding w:prefixMappings="xmlns:ns0='http://purl.org/dc/elements/1.1/' xmlns:ns1='http://schemas.openxmlformats.org/package/2006/metadata/core-properties' " w:xpath="/ns1:coreProperties[1]/ns0:creator[1]" w:storeItemID="{6C3C8BC8-F283-45AE-878A-BAB7291924A1}"/>
                                         <w:text/>
                                       </w:sdtPr>
+                                      <w:sdtEndPr/>
                                       <w:sdtContent>
                                         <w:p>
                                           <w:pPr>
@@ -332,6 +337,7 @@
                                           <w:dataBinding w:prefixMappings="xmlns:ns0='http://purl.org/dc/elements/1.1/' xmlns:ns1='http://schemas.openxmlformats.org/package/2006/metadata/core-properties' " w:xpath="/ns1:coreProperties[1]/ns1:category[1]" w:storeItemID="{6C3C8BC8-F283-45AE-878A-BAB7291924A1}"/>
                                           <w:text/>
                                         </w:sdtPr>
+                                        <w:sdtEndPr/>
                                         <w:sdtContent>
                                           <w:r>
                                             <w:rPr>
@@ -469,6 +475,7 @@
                                   <w:dataBinding w:prefixMappings="xmlns:ns0='http://purl.org/dc/elements/1.1/' xmlns:ns1='http://schemas.openxmlformats.org/package/2006/metadata/core-properties' " w:xpath="/ns1:coreProperties[1]/ns0:title[1]" w:storeItemID="{6C3C8BC8-F283-45AE-878A-BAB7291924A1}"/>
                                   <w:text/>
                                 </w:sdtPr>
+                                <w:sdtEndPr/>
                                 <w:sdtContent>
                                   <w:p>
                                     <w:pPr>
@@ -507,6 +514,7 @@
                                   <w:dataBinding w:prefixMappings="xmlns:ns0='http://purl.org/dc/elements/1.1/' xmlns:ns1='http://schemas.openxmlformats.org/package/2006/metadata/core-properties' " w:xpath="/ns1:coreProperties[1]/ns0:subject[1]" w:storeItemID="{6C3C8BC8-F283-45AE-878A-BAB7291924A1}"/>
                                   <w:text/>
                                 </w:sdtPr>
+                                <w:sdtEndPr/>
                                 <w:sdtContent>
                                   <w:p>
                                     <w:pPr>
@@ -563,6 +571,7 @@
                                   <w:dataBinding w:prefixMappings="xmlns:ns0='http://schemas.microsoft.com/office/2006/coverPageProps' " w:xpath="/ns0:CoverPageProperties[1]/ns0:Abstract[1]" w:storeItemID="{55AF091B-3C7A-41E3-B477-F2FDAA23CFDA}"/>
                                   <w:text/>
                                 </w:sdtPr>
+                                <w:sdtEndPr/>
                                 <w:sdtContent>
                                   <w:p>
                                     <w:pPr>
@@ -592,6 +601,7 @@
                                   <w:dataBinding w:prefixMappings="xmlns:ns0='http://purl.org/dc/elements/1.1/' xmlns:ns1='http://schemas.openxmlformats.org/package/2006/metadata/core-properties' " w:xpath="/ns1:coreProperties[1]/ns0:creator[1]" w:storeItemID="{6C3C8BC8-F283-45AE-878A-BAB7291924A1}"/>
                                   <w:text/>
                                 </w:sdtPr>
+                                <w:sdtEndPr/>
                                 <w:sdtContent>
                                   <w:p>
                                     <w:pPr>
@@ -630,6 +640,7 @@
                                     <w:dataBinding w:prefixMappings="xmlns:ns0='http://purl.org/dc/elements/1.1/' xmlns:ns1='http://schemas.openxmlformats.org/package/2006/metadata/core-properties' " w:xpath="/ns1:coreProperties[1]/ns1:category[1]" w:storeItemID="{6C3C8BC8-F283-45AE-878A-BAB7291924A1}"/>
                                     <w:text/>
                                   </w:sdtPr>
+                                  <w:sdtEndPr/>
                                   <w:sdtContent>
                                     <w:r>
                                       <w:rPr>
@@ -768,6 +779,88 @@
         <w:t xml:space="preserve">&gt; and &lt;underline&gt; </w:t>
       </w:r>
     </w:p>
+    <w:p>
+      <w:pPr>
+        <w:pStyle w:val="ListParagraph"/>
+        <w:numPr>
+          <w:ilvl w:val="0"/>
+          <w:numId w:val="1"/>
+        </w:numPr>
+      </w:pPr>
+      <w:r>
+        <w:t xml:space="preserve">Creating a Validation Message label underneath the textboxes that validates whether the username is letters only and password is </w:t>
+      </w:r>
+      <w:proofErr w:type="spellStart"/>
+      <w:r>
+        <w:t>atleast</w:t>
+      </w:r>
+      <w:proofErr w:type="spellEnd"/>
+      <w:r>
+        <w:t xml:space="preserve"> 8 characters by passing it to the </w:t>
+      </w:r>
+      <w:proofErr w:type="spellStart"/>
+      <w:r>
+        <w:t>Buisness</w:t>
+      </w:r>
+      <w:proofErr w:type="spellEnd"/>
+      <w:r>
+        <w:t xml:space="preserve"> Layer and returning the message.</w:t>
+      </w:r>
+    </w:p>
+    <w:p>
+      <w:pPr>
+        <w:pStyle w:val="ListParagraph"/>
+        <w:numPr>
+          <w:ilvl w:val="0"/>
+          <w:numId w:val="1"/>
+        </w:numPr>
+      </w:pPr>
+      <w:r>
+        <w:t>Elements when collapsed take up space but are not shown vs when items are not visible they do not take up space.</w:t>
+      </w:r>
+    </w:p>
+    <w:p>
+      <w:pPr>
+        <w:pStyle w:val="ListParagraph"/>
+        <w:numPr>
+          <w:ilvl w:val="0"/>
+          <w:numId w:val="1"/>
+        </w:numPr>
+      </w:pPr>
+      <w:r>
+        <w:t xml:space="preserve">Added date created to the table, defaulted as get </w:t>
+      </w:r>
+      <w:proofErr w:type="gramStart"/>
+      <w:r>
+        <w:t>date(</w:t>
+      </w:r>
+      <w:proofErr w:type="gramEnd"/>
+      <w:r>
+        <w:t>), also used defaults for some variables</w:t>
+      </w:r>
+    </w:p>
+    <w:p>
+      <w:pPr>
+        <w:pStyle w:val="ListParagraph"/>
+        <w:numPr>
+          <w:ilvl w:val="0"/>
+          <w:numId w:val="1"/>
+        </w:numPr>
+      </w:pPr>
+      <w:r>
+        <w:t xml:space="preserve">In the transfers table, referencing the Foreign Key of source Account </w:t>
+      </w:r>
+      <w:proofErr w:type="spellStart"/>
+      <w:r>
+        <w:t>Num</w:t>
+      </w:r>
+      <w:proofErr w:type="spellEnd"/>
+      <w:r>
+        <w:t xml:space="preserve"> from User Table. In the same keeping check that amount is greater than 0.</w:t>
+      </w:r>
+      <w:bookmarkStart w:id="0" w:name="_GoBack"/>
+      <w:bookmarkEnd w:id="0"/>
+    </w:p>
     <w:p/>
     <w:p/>
     <w:p/>
@@ -921,8 +1014,6 @@
       <w:r>
         <w:t xml:space="preserve"> Studio</w:t>
       </w:r>
-      <w:bookmarkStart w:id="0" w:name="_GoBack"/>
-      <w:bookmarkEnd w:id="0"/>
     </w:p>
     <w:sectPr>
       <w:pgSz w:w="11906" w:h="16838"/>
@@ -960,7 +1051,7 @@
         <w:rFonts w:hint="default"/>
       </w:rPr>
     </w:lvl>
-    <w:lvl w:ilvl="1" w:tplc="40090019" w:tentative="1">
+    <w:lvl w:ilvl="1" w:tplc="40090019">
       <w:start w:val="1"/>
       <w:numFmt w:val="lowerLetter"/>
       <w:lvlText w:val="%2."/>
@@ -1513,6 +1604,7 @@
   <w:style w:type="character" w:default="1" w:styleId="DefaultParagraphFont">
     <w:name w:val="Default Paragraph Font"/>
     <w:uiPriority w:val="1"/>
+    <w:semiHidden/>
     <w:unhideWhenUsed/>
   </w:style>
   <w:style w:type="table" w:default="1" w:styleId="TableNormal">

</xml_diff>